<commit_message>
Revised logsheet for caldip processing
</commit_message>
<xml_diff>
--- a/Documents/logsheets_blank/YYXXX_m_moorproc_processing_caldip.docx
+++ b/Documents/logsheets_blank/YYXXX_m_moorproc_processing_caldip.docx
@@ -260,15 +260,7 @@
           </w:tcPr>
           <w:p>
             <w:r>
-              <w:t xml:space="preserve">Check </w:t>
-            </w:r>
-            <w:proofErr w:type="gramStart"/>
-            <w:r>
-              <w:t>microcat  log</w:t>
-            </w:r>
-            <w:proofErr w:type="gramEnd"/>
-            <w:r>
-              <w:t xml:space="preserve"> against CTD log</w:t>
+              <w:t>Check microcat  log against CTD log</w:t>
             </w:r>
           </w:p>
         </w:tc>
@@ -336,27 +328,14 @@
             <w:r>
               <w:t>ing/</w:t>
             </w:r>
-            <w:proofErr w:type="spellStart"/>
-            <w:r>
-              <w:t>proc_calib</w:t>
-            </w:r>
-            <w:proofErr w:type="spellEnd"/>
-            <w:r>
-              <w:t>/</w:t>
+            <w:r>
+              <w:t>proc_calib/</w:t>
             </w:r>
             <w:r>
               <w:t>&lt;cruise&gt;</w:t>
             </w:r>
             <w:r>
-              <w:t>/</w:t>
-            </w:r>
-            <w:proofErr w:type="spellStart"/>
-            <w:r>
-              <w:t>cal_dip</w:t>
-            </w:r>
-            <w:proofErr w:type="spellEnd"/>
-            <w:r>
-              <w:t>/</w:t>
+              <w:t>/cal_dip/</w:t>
             </w:r>
           </w:p>
         </w:tc>
@@ -444,15 +423,7 @@
               <w:t>&lt;cruise&gt;</w:t>
             </w:r>
             <w:r>
-              <w:t>/</w:t>
-            </w:r>
-            <w:proofErr w:type="spellStart"/>
-            <w:r>
-              <w:t>microcat_cal_dip</w:t>
-            </w:r>
-            <w:proofErr w:type="spellEnd"/>
-            <w:r>
-              <w:t>/cast##</w:t>
+              <w:t>/microcat_cal_dip/cast##</w:t>
             </w:r>
           </w:p>
         </w:tc>
@@ -463,52 +434,17 @@
           <w:p>
             <w:pPr>
               <w:rPr>
-                <w:b/>
-                <w:bCs/>
                 <w:i/>
                 <w:iCs/>
               </w:rPr>
             </w:pPr>
             <w:r>
               <w:rPr>
-                <w:b/>
-                <w:bCs/>
-                <w:i/>
-                <w:iCs/>
-              </w:rPr>
-              <w:t>[</w:t>
-            </w:r>
-            <w:proofErr w:type="spellStart"/>
-            <w:r>
-              <w:rPr>
-                <w:b/>
-                <w:bCs/>
-                <w:i/>
-                <w:iCs/>
-              </w:rPr>
-              <w:t>SerialNum</w:t>
-            </w:r>
-            <w:proofErr w:type="spellEnd"/>
-            <w:r>
-              <w:rPr>
-                <w:b/>
-                <w:bCs/>
-                <w:i/>
-                <w:iCs/>
-              </w:rPr>
-              <w:t>]_</w:t>
-            </w:r>
-            <w:proofErr w:type="spellStart"/>
-            <w:r>
-              <w:rPr>
-                <w:b/>
-                <w:bCs/>
-                <w:i/>
-                <w:iCs/>
-              </w:rPr>
-              <w:t>cal_dip_data.cnv</w:t>
-            </w:r>
-            <w:proofErr w:type="spellEnd"/>
+                <w:i/>
+                <w:iCs/>
+              </w:rPr>
+              <w:t>Copy microcat data and rename:</w:t>
+            </w:r>
           </w:p>
           <w:p>
             <w:pPr>
@@ -526,39 +462,8 @@
                 <w:i/>
                 <w:iCs/>
               </w:rPr>
-              <w:t>[</w:t>
-            </w:r>
-            <w:proofErr w:type="spellStart"/>
-            <w:r>
-              <w:rPr>
-                <w:b/>
-                <w:bCs/>
-                <w:i/>
-                <w:iCs/>
-              </w:rPr>
-              <w:t>SerialNum</w:t>
-            </w:r>
-            <w:proofErr w:type="spellEnd"/>
-            <w:r>
-              <w:rPr>
-                <w:b/>
-                <w:bCs/>
-                <w:i/>
-                <w:iCs/>
-              </w:rPr>
-              <w:t>]_</w:t>
-            </w:r>
-            <w:proofErr w:type="spellStart"/>
-            <w:r>
-              <w:rPr>
-                <w:b/>
-                <w:bCs/>
-                <w:i/>
-                <w:iCs/>
-              </w:rPr>
-              <w:t>cal_dip_data.hex</w:t>
-            </w:r>
-            <w:proofErr w:type="spellEnd"/>
+              <w:t>[SerialNum]_cal_dip_data.cnv</w:t>
+            </w:r>
           </w:p>
           <w:p>
             <w:pPr>
@@ -576,6 +481,25 @@
                 <w:i/>
                 <w:iCs/>
               </w:rPr>
+              <w:t>[SerialNum]_cal_dip_data.hex</w:t>
+            </w:r>
+          </w:p>
+          <w:p>
+            <w:pPr>
+              <w:rPr>
+                <w:b/>
+                <w:bCs/>
+                <w:i/>
+                <w:iCs/>
+              </w:rPr>
+            </w:pPr>
+            <w:r>
+              <w:rPr>
+                <w:b/>
+                <w:bCs/>
+                <w:i/>
+                <w:iCs/>
+              </w:rPr>
               <w:t>[SerialNum]_cal_dip_data.xml</w:t>
             </w:r>
           </w:p>
@@ -595,50 +519,8 @@
                 <w:i/>
                 <w:iCs/>
               </w:rPr>
-              <w:t>[</w:t>
-            </w:r>
-            <w:proofErr w:type="spellStart"/>
-            <w:r>
-              <w:rPr>
-                <w:b/>
-                <w:bCs/>
-                <w:i/>
-                <w:iCs/>
-              </w:rPr>
-              <w:t>SerialNum</w:t>
-            </w:r>
-            <w:proofErr w:type="spellEnd"/>
-            <w:r>
-              <w:rPr>
-                <w:b/>
-                <w:bCs/>
-                <w:i/>
-                <w:iCs/>
-              </w:rPr>
-              <w:t>]_</w:t>
-            </w:r>
-            <w:proofErr w:type="spellStart"/>
-            <w:r>
-              <w:rPr>
-                <w:b/>
-                <w:bCs/>
-                <w:i/>
-                <w:iCs/>
-              </w:rPr>
-              <w:t>cal_dip_</w:t>
-            </w:r>
-            <w:proofErr w:type="gramStart"/>
-            <w:r>
-              <w:rPr>
-                <w:b/>
-                <w:bCs/>
-                <w:i/>
-                <w:iCs/>
-              </w:rPr>
-              <w:t>data.xmlcon</w:t>
-            </w:r>
-            <w:proofErr w:type="spellEnd"/>
-            <w:proofErr w:type="gramEnd"/>
+              <w:t>[SerialNum]_cal_dip_data.xmlcon</w:t>
+            </w:r>
           </w:p>
         </w:tc>
         <w:tc>
@@ -700,29 +582,13 @@
               <w:t>moorings</w:t>
             </w:r>
             <w:r>
-              <w:t>/</w:t>
-            </w:r>
-            <w:proofErr w:type="spellStart"/>
-            <w:r>
-              <w:t>proc_calib</w:t>
-            </w:r>
-            <w:proofErr w:type="spellEnd"/>
-            <w:r>
-              <w:t>/</w:t>
+              <w:t>/proc_calib/</w:t>
             </w:r>
             <w:r>
               <w:t>&lt;cruise&gt;</w:t>
             </w:r>
             <w:r>
-              <w:t>/</w:t>
-            </w:r>
-            <w:proofErr w:type="spellStart"/>
-            <w:r>
-              <w:t>cal_dip</w:t>
-            </w:r>
-            <w:proofErr w:type="spellEnd"/>
-            <w:r>
-              <w:t>/microcat</w:t>
+              <w:t>/cal_dip/microcat</w:t>
             </w:r>
           </w:p>
         </w:tc>
@@ -731,13 +597,8 @@
             <w:tcW w:w="3402" w:type="dxa"/>
           </w:tcPr>
           <w:p>
-            <w:proofErr w:type="spellStart"/>
-            <w:r>
-              <w:t>mkdir</w:t>
-            </w:r>
-            <w:proofErr w:type="spellEnd"/>
-            <w:r>
-              <w:t xml:space="preserve"> </w:t>
+            <w:r>
+              <w:t xml:space="preserve">mkdir </w:t>
             </w:r>
             <w:r>
               <w:rPr>
@@ -805,80 +666,85 @@
             <w:tcW w:w="4962" w:type="dxa"/>
           </w:tcPr>
           <w:p>
+            <w:r>
+              <w:t>/cruises</w:t>
+            </w:r>
+            <w:r>
+              <w:t>/</w:t>
+            </w:r>
+            <w:r>
+              <w:t>&lt;cruise&gt;</w:t>
+            </w:r>
+            <w:r>
+              <w:t>/data/ctd/</w:t>
+            </w:r>
+          </w:p>
+          <w:p>
+            <w:r>
+              <w:t xml:space="preserve">/cruises/&lt;cruise&gt;/data </w:t>
+            </w:r>
+            <w:r>
+              <w:t>/ctd/</w:t>
+            </w:r>
+          </w:p>
+        </w:tc>
+        <w:tc>
+          <w:tcPr>
+            <w:tcW w:w="3402" w:type="dxa"/>
+          </w:tcPr>
+          <w:p>
+            <w:r>
+              <w:t>Check the following files are there</w:t>
+            </w:r>
+            <w:r>
+              <w:t>, if not run ctd processing</w:t>
+            </w:r>
+            <w:r>
+              <w:t>:</w:t>
+            </w:r>
+          </w:p>
+          <w:p>
             <w:pPr>
               <w:rPr>
-                <w:strike/>
+                <w:b/>
+                <w:bCs/>
+                <w:i/>
+                <w:iCs/>
               </w:rPr>
             </w:pPr>
             <w:r>
-              <w:rPr>
-                <w:strike/>
-              </w:rPr>
-              <w:t>/cruises</w:t>
-            </w:r>
-            <w:r>
-              <w:rPr>
-                <w:strike/>
-              </w:rPr>
-              <w:t>/</w:t>
-            </w:r>
-            <w:r>
-              <w:rPr>
-                <w:strike/>
+              <w:t xml:space="preserve">cp </w:t>
+            </w:r>
+            <w:r>
+              <w:rPr>
+                <w:b/>
+                <w:bCs/>
+                <w:i/>
+                <w:iCs/>
+              </w:rPr>
+              <w:t>ctd_</w:t>
+            </w:r>
+            <w:r>
+              <w:rPr>
+                <w:b/>
+                <w:bCs/>
+                <w:i/>
+                <w:iCs/>
               </w:rPr>
               <w:t>&lt;cruise&gt;</w:t>
             </w:r>
             <w:r>
               <w:rPr>
-                <w:strike/>
-              </w:rPr>
-              <w:t>/data/ctd/</w:t>
-            </w:r>
-          </w:p>
-          <w:p>
-            <w:pPr>
-              <w:rPr>
-                <w:strike/>
-              </w:rPr>
-            </w:pPr>
-            <w:r>
-              <w:rPr>
-                <w:strike/>
-              </w:rPr>
-              <w:t>/cruises/&lt;cruise&gt;/data</w:t>
-            </w:r>
-            <w:r>
-              <w:rPr>
-                <w:strike/>
-              </w:rPr>
-              <w:t xml:space="preserve"> </w:t>
-            </w:r>
-            <w:r>
-              <w:rPr>
-                <w:strike/>
-              </w:rPr>
-              <w:t>/ctd/</w:t>
-            </w:r>
-          </w:p>
-        </w:tc>
-        <w:tc>
-          <w:tcPr>
-            <w:tcW w:w="3402" w:type="dxa"/>
-          </w:tcPr>
-          <w:p>
-            <w:pPr>
-              <w:rPr>
-                <w:b/>
-                <w:bCs/>
-                <w:i/>
-                <w:iCs/>
-                <w:strike/>
-              </w:rPr>
-            </w:pPr>
-            <w:r>
-              <w:rPr>
-                <w:strike/>
-              </w:rPr>
+                <w:b/>
+                <w:bCs/>
+                <w:i/>
+                <w:iCs/>
+              </w:rPr>
+              <w:t>_###_psal.nc</w:t>
+            </w:r>
+          </w:p>
+          <w:p>
+            <w:r>
               <w:t xml:space="preserve">cp </w:t>
             </w:r>
             <w:r>
@@ -887,7 +753,6 @@
                 <w:bCs/>
                 <w:i/>
                 <w:iCs/>
-                <w:strike/>
               </w:rPr>
               <w:t>ctd_</w:t>
             </w:r>
@@ -897,7 +762,6 @@
                 <w:bCs/>
                 <w:i/>
                 <w:iCs/>
-                <w:strike/>
               </w:rPr>
               <w:t>&lt;cruise&gt;</w:t>
             </w:r>
@@ -907,50 +771,6 @@
                 <w:bCs/>
                 <w:i/>
                 <w:iCs/>
-                <w:strike/>
-              </w:rPr>
-              <w:t>_###_psal.nc</w:t>
-            </w:r>
-          </w:p>
-          <w:p>
-            <w:pPr>
-              <w:rPr>
-                <w:strike/>
-              </w:rPr>
-            </w:pPr>
-            <w:r>
-              <w:rPr>
-                <w:strike/>
-              </w:rPr>
-              <w:t xml:space="preserve">cp </w:t>
-            </w:r>
-            <w:r>
-              <w:rPr>
-                <w:b/>
-                <w:bCs/>
-                <w:i/>
-                <w:iCs/>
-                <w:strike/>
-              </w:rPr>
-              <w:t>ctd_</w:t>
-            </w:r>
-            <w:r>
-              <w:rPr>
-                <w:b/>
-                <w:bCs/>
-                <w:i/>
-                <w:iCs/>
-                <w:strike/>
-              </w:rPr>
-              <w:t>&lt;cruise&gt;</w:t>
-            </w:r>
-            <w:r>
-              <w:rPr>
-                <w:b/>
-                <w:bCs/>
-                <w:i/>
-                <w:iCs/>
-                <w:strike/>
               </w:rPr>
               <w:t>_###_raw.nc</w:t>
             </w:r>
@@ -1032,7 +852,6 @@
                 <w:iCs/>
               </w:rPr>
             </w:pPr>
-            <w:proofErr w:type="spellStart"/>
             <w:r>
               <w:rPr>
                 <w:b/>
@@ -1042,7 +861,6 @@
               </w:rPr>
               <w:t>mc_call_caldip.m</w:t>
             </w:r>
-            <w:proofErr w:type="spellEnd"/>
           </w:p>
         </w:tc>
         <w:tc>
@@ -1104,23 +922,7 @@
               <w:t>&lt;cruise&gt;</w:t>
             </w:r>
             <w:r>
-              <w:t>/</w:t>
-            </w:r>
-            <w:proofErr w:type="spellStart"/>
-            <w:r>
-              <w:t>report_tables</w:t>
-            </w:r>
-            <w:proofErr w:type="spellEnd"/>
-            <w:r>
-              <w:t>/</w:t>
-            </w:r>
-            <w:proofErr w:type="spellStart"/>
-            <w:r>
-              <w:t>datareports</w:t>
-            </w:r>
-            <w:proofErr w:type="spellEnd"/>
-            <w:r>
-              <w:t>/</w:t>
+              <w:t>/report_tables/datareports/</w:t>
             </w:r>
           </w:p>
           <w:p>
@@ -1128,40 +930,18 @@
               <w:t>-</w:t>
             </w:r>
             <w:r>
-              <w:t>figs/</w:t>
-            </w:r>
-            <w:proofErr w:type="spellStart"/>
-            <w:r>
-              <w:t>cal_dip</w:t>
-            </w:r>
-            <w:proofErr w:type="spellEnd"/>
-            <w:r>
-              <w:t>/cast##</w:t>
-            </w:r>
-            <w:r>
-              <w:t>_all_&lt;var</w:t>
-            </w:r>
-            <w:proofErr w:type="gramStart"/>
-            <w:r>
-              <w:t>&gt;.fig</w:t>
-            </w:r>
-            <w:proofErr w:type="gramEnd"/>
+              <w:t>figs/cal_dip/cast##</w:t>
+            </w:r>
+            <w:r>
+              <w:t>_all_&lt;var&gt;.fig</w:t>
+            </w:r>
           </w:p>
           <w:p>
             <w:r>
               <w:t>-</w:t>
             </w:r>
             <w:r>
-              <w:t>stats</w:t>
-            </w:r>
-            <w:r>
-              <w:t>/</w:t>
-            </w:r>
-            <w:r>
-              <w:t>microcat_check</w:t>
-            </w:r>
-            <w:r>
-              <w:t>##</w:t>
+              <w:t>stats/microcat_check##</w:t>
             </w:r>
             <w:r>
               <w:t>.log</w:t>
@@ -1254,7 +1034,6 @@
                 <w:iCs/>
               </w:rPr>
             </w:pPr>
-            <w:proofErr w:type="spellStart"/>
             <w:r>
               <w:rPr>
                 <w:b/>
@@ -1264,7 +1043,6 @@
               </w:rPr>
               <w:t>mc_calldip_check.m</w:t>
             </w:r>
-            <w:proofErr w:type="spellEnd"/>
           </w:p>
         </w:tc>
         <w:tc>
@@ -1326,23 +1104,7 @@
               <w:t>&lt;cruise&gt;</w:t>
             </w:r>
             <w:r>
-              <w:t>/</w:t>
-            </w:r>
-            <w:proofErr w:type="spellStart"/>
-            <w:r>
-              <w:t>report_tables</w:t>
-            </w:r>
-            <w:proofErr w:type="spellEnd"/>
-            <w:r>
-              <w:t>/</w:t>
-            </w:r>
-            <w:proofErr w:type="spellStart"/>
-            <w:r>
-              <w:t>datareports</w:t>
-            </w:r>
-            <w:proofErr w:type="spellEnd"/>
-            <w:r>
-              <w:t>/</w:t>
+              <w:t>/report_tables/datareports/</w:t>
             </w:r>
           </w:p>
           <w:p>
@@ -1350,15 +1112,7 @@
               <w:t>-</w:t>
             </w:r>
             <w:r>
-              <w:t>figs/</w:t>
-            </w:r>
-            <w:proofErr w:type="spellStart"/>
-            <w:r>
-              <w:t>cal_dip</w:t>
-            </w:r>
-            <w:proofErr w:type="spellEnd"/>
-            <w:r>
-              <w:t>/</w:t>
+              <w:t>figs/cal_dip/</w:t>
             </w:r>
             <w:r>
               <w:t>microcat_check_</w:t>
@@ -1568,20 +1322,8 @@
         <w:sz w:val="28"/>
         <w:szCs w:val="28"/>
       </w:rPr>
-      <w:t xml:space="preserve"> </w:t>
+      <w:t xml:space="preserve"> Caldip</w:t>
     </w:r>
-    <w:proofErr w:type="spellStart"/>
-    <w:r>
-      <w:rPr>
-        <w:i/>
-        <w:iCs/>
-        <w:color w:val="1F3864" w:themeColor="accent1" w:themeShade="80"/>
-        <w:sz w:val="28"/>
-        <w:szCs w:val="28"/>
-      </w:rPr>
-      <w:t>Caldip</w:t>
-    </w:r>
-    <w:proofErr w:type="spellEnd"/>
     <w:r>
       <w:rPr>
         <w:i/>
@@ -1622,7 +1364,6 @@
       </w:rPr>
       <w:tab/>
     </w:r>
-    <w:proofErr w:type="spellStart"/>
     <w:r>
       <w:rPr>
         <w:i/>
@@ -1631,18 +1372,7 @@
         <w:sz w:val="28"/>
         <w:szCs w:val="28"/>
       </w:rPr>
-      <w:t>m_moorproc_toolbox</w:t>
-    </w:r>
-    <w:proofErr w:type="spellEnd"/>
-    <w:r>
-      <w:rPr>
-        <w:i/>
-        <w:iCs/>
-        <w:color w:val="1F3864" w:themeColor="accent1" w:themeShade="80"/>
-        <w:sz w:val="28"/>
-        <w:szCs w:val="28"/>
-      </w:rPr>
-      <w:t xml:space="preserve"> processing log</w:t>
+      <w:t>m_moorproc_toolbox processing log</w:t>
     </w:r>
   </w:p>
 </w:hdr>

</xml_diff>